<commit_message>
OSZ v10 - gdoc version
</commit_message>
<xml_diff>
--- a/features/cave-dossier/osz-template/templates/Zapisnik_OSZ_v10.docx
+++ b/features/cave-dossier/osz-template/templates/Zapisnik_OSZ_v10.docx
@@ -3219,7 +3219,7 @@
       </w:tblGrid>
       <w:tr>
         <w:trPr>
-          <w:trHeight w:val="2749"/>
+          <w:trHeight w:val="2408"/>
         </w:trPr>
         <w:tc>
           <w:tcPr>
@@ -5650,7 +5650,7 @@
       </w:tr>
       <w:tr>
         <w:trPr>
-          <w:trHeight w:val="5917"/>
+          <w:trHeight w:val="5669"/>
         </w:trPr>
         <w:sdt>
           <w:sdtPr>
@@ -6667,7 +6667,7 @@
       <w:tr>
         <w:trPr>
           <w:cantSplit/>
-          <w:trHeight w:val="1928"/>
+          <w:trHeight w:val="1871"/>
           <w:tblHeader/>
         </w:trPr>
         <w:sdt>
@@ -6909,7 +6909,7 @@
       <w:tr>
         <w:trPr>
           <w:cantSplit/>
-          <w:trHeight w:val="1928"/>
+          <w:trHeight w:val="1871"/>
           <w:tblHeader/>
         </w:trPr>
         <w:sdt>
@@ -7104,7 +7104,7 @@
       <w:tr>
         <w:trPr>
           <w:cantSplit/>
-          <w:trHeight w:val="1928"/>
+          <w:trHeight w:val="1871"/>
           <w:tblHeader/>
         </w:trPr>
         <w:sdt>
@@ -7217,7 +7217,7 @@
       <w:tr>
         <w:trPr>
           <w:cantSplit/>
-          <w:trHeight w:val="1928"/>
+          <w:trHeight w:val="1871"/>
           <w:tblHeader/>
         </w:trPr>
         <w:tc>
@@ -7328,7 +7328,7 @@
       </w:tr>
       <w:tr>
         <w:trPr>
-          <w:trHeight w:val="1928"/>
+          <w:trHeight w:val="1871"/>
           <w:tblHeader/>
         </w:trPr>
         <w:tc>
@@ -7867,6 +7867,7 @@
         </w:tc>
       </w:tr>
     </w:tbl>
+    <w:p/>
     <w:tbl>
       <w:tblPr>
         <w:tblStyle w:val="af3"/>
@@ -9384,7 +9385,7 @@
       </w:tr>
       <w:tr>
         <w:trPr>
-          <w:trHeight w:val="1474"/>
+          <w:trHeight w:val="1361"/>
         </w:trPr>
         <w:tc>
           <w:tcPr>
@@ -12289,7 +12290,9 @@
   </w:compat>
   <w:rsids>
     <w:rsidRoot w:val="00442AB9"/>
+    <w:rsid w:val="002F1B08"/>
     <w:rsid w:val="00442AB9"/>
+    <w:rsid w:val="00454D92"/>
     <w:rsid w:val="00946D95"/>
     <w:rsid w:val="00B55275"/>
     <w:rsid w:val="00C82BD5"/>

</xml_diff>

<commit_message>
chore(auto): checkpoint — features/cave-dossier (13 files)
Automatic commit by the checkpoint hook (.claude/hooks/auto-commit.sh).
Not a curated commit — see /wrap-up commits for session narrative.

Co-Authored-By: Claude <noreply@anthropic.com>
</commit_message>
<xml_diff>
--- a/features/cave-dossier/osz-template/templates/Zapisnik_OSZ_v10.docx
+++ b/features/cave-dossier/osz-template/templates/Zapisnik_OSZ_v10.docx
@@ -1333,7 +1333,7 @@
     <w:tbl>
       <w:tblPr>
         <w:tblStyle w:val="af"/>
-        <w:tblW w:w="0" w:type="auto"/>
+        <w:tblW w:w="0" w:type="dxa"/>
         <w:tblBorders>
           <w:top w:val="single" w:sz="12" w:space="0" w:color="000000"/>
           <w:left w:val="single" w:sz="12" w:space="0" w:color="000000"/>
@@ -1404,6 +1404,7 @@
       </w:tr>
       <w:tr>
         <w:trPr>
+          <w:cantSplit/>
           <w:trHeight w:val="340"/>
         </w:trPr>
         <w:tc>
@@ -1415,11 +1416,13 @@
               <w:left w:val="single" w:sz="4" w:space="0" w:color="000000"/>
               <w:right w:val="single" w:sz="4" w:space="0" w:color="000000"/>
             </w:tcBorders>
+            <w:vAlign w:val="center"/>
           </w:tcPr>
           <w:p>
             <w:pPr>
               <w:widowControl w:val="0"/>
               <w:spacing w:after="0"/>
+              <w:jc w:val="center"/>
               <w:rPr>
                 <w:rFonts w:ascii="Arial" w:eastAsia="Arial" w:hAnsi="Arial" w:cs="Arial"/>
                 <w:color w:val="000000"/>
@@ -1575,6 +1578,7 @@
               <w:p>
                 <w:pPr>
                   <w:spacing w:after="0" w:line="240" w:lineRule="auto"/>
+                  <w:jc w:val="center"/>
                   <w:rPr>
                     <w:rFonts w:ascii="Arial" w:eastAsia="Arial" w:hAnsi="Arial" w:cs="Arial"/>
                     <w:b/>
@@ -1673,6 +1677,7 @@
                     <w:between w:val="nil"/>
                   </w:pBdr>
                   <w:spacing w:after="0" w:line="240" w:lineRule="auto"/>
+                  <w:jc w:val="center"/>
                   <w:rPr>
                     <w:rFonts w:ascii="Arial" w:eastAsia="Arial" w:hAnsi="Arial" w:cs="Arial"/>
                     <w:b/>
@@ -1894,7 +1899,7 @@
               <w:bottom w:val="dashed" w:sz="4" w:space="0" w:color="auto"/>
               <w:right w:val="single" w:sz="4" w:space="0" w:color="000000"/>
             </w:tcBorders>
-            <w:vAlign w:val="center"/>
+            <w:vAlign w:val="bottom"/>
           </w:tcPr>
           <w:p>
             <w:pPr>
@@ -1967,7 +1972,7 @@
               <w:bottom w:val="dashed" w:sz="4" w:space="0" w:color="auto"/>
               <w:right w:val="single" w:sz="4" w:space="0" w:color="000000"/>
             </w:tcBorders>
-            <w:vAlign w:val="center"/>
+            <w:vAlign w:val="bottom"/>
           </w:tcPr>
           <w:p>
             <w:pPr>
@@ -2077,7 +2082,7 @@
               <w:bottom w:val="dashed" w:sz="4" w:space="0" w:color="auto"/>
               <w:right w:val="single" w:sz="4" w:space="0" w:color="000000"/>
             </w:tcBorders>
-            <w:vAlign w:val="center"/>
+            <w:vAlign w:val="bottom"/>
           </w:tcPr>
           <w:p>
             <w:pPr>
@@ -2150,7 +2155,7 @@
               <w:bottom w:val="dashed" w:sz="4" w:space="0" w:color="auto"/>
               <w:right w:val="single" w:sz="4" w:space="0" w:color="000000"/>
             </w:tcBorders>
-            <w:vAlign w:val="center"/>
+            <w:vAlign w:val="bottom"/>
           </w:tcPr>
           <w:p>
             <w:pPr>
@@ -2258,7 +2263,7 @@
               <w:bottom w:val="dashed" w:sz="4" w:space="0" w:color="auto"/>
               <w:right w:val="single" w:sz="4" w:space="0" w:color="000000"/>
             </w:tcBorders>
-            <w:vAlign w:val="center"/>
+            <w:vAlign w:val="bottom"/>
           </w:tcPr>
           <w:p>
             <w:pPr>
@@ -2331,7 +2336,7 @@
               <w:bottom w:val="dashed" w:sz="4" w:space="0" w:color="auto"/>
               <w:right w:val="single" w:sz="4" w:space="0" w:color="000000"/>
             </w:tcBorders>
-            <w:vAlign w:val="center"/>
+            <w:vAlign w:val="bottom"/>
           </w:tcPr>
           <w:p>
             <w:pPr>
@@ -12290,7 +12295,10 @@
   </w:compat>
   <w:rsids>
     <w:rsidRoot w:val="00442AB9"/>
+    <w:rsid w:val="001023D2"/>
+    <w:rsid w:val="002A4D6B"/>
     <w:rsid w:val="002F1B08"/>
+    <w:rsid w:val="00381310"/>
     <w:rsid w:val="00442AB9"/>
     <w:rsid w:val="00454D92"/>
     <w:rsid w:val="00946D95"/>

</xml_diff>

<commit_message>
chore(auto): checkpoint — features/cave-dossier (3 files)
Automatic commit by the checkpoint hook (.claude/hooks/auto-commit.sh).
Not a curated commit — see /wrap-up commits for session narrative.

Co-Authored-By: Claude <noreply@anthropic.com>
</commit_message>
<xml_diff>
--- a/features/cave-dossier/osz-template/templates/Zapisnik_OSZ_v10.docx
+++ b/features/cave-dossier/osz-template/templates/Zapisnik_OSZ_v10.docx
@@ -120,6 +120,8 @@
               <w:cnfStyle w:val="000000000000" w:firstRow="0" w:lastRow="0" w:firstColumn="0" w:lastColumn="0" w:oddVBand="0" w:evenVBand="0" w:oddHBand="0" w:evenHBand="0" w:firstRowFirstColumn="0" w:firstRowLastColumn="0" w:lastRowFirstColumn="0" w:lastRowLastColumn="0"/>
               <w:rPr>
                 <w:rFonts w:ascii="Arial" w:eastAsia="Arial" w:hAnsi="Arial" w:cs="Arial"/>
+                <w:b/>
+                <w:bCs/>
                 <w:sz w:val="24"/>
                 <w:szCs w:val="24"/>
               </w:rPr>
@@ -12295,6 +12297,7 @@
   </w:compat>
   <w:rsids>
     <w:rsidRoot w:val="00442AB9"/>
+    <w:rsid w:val="00091209"/>
     <w:rsid w:val="001023D2"/>
     <w:rsid w:val="002A4D6B"/>
     <w:rsid w:val="002F1B08"/>
@@ -12302,6 +12305,7 @@
     <w:rsid w:val="00442AB9"/>
     <w:rsid w:val="00454D92"/>
     <w:rsid w:val="00946D95"/>
+    <w:rsid w:val="009C06FF"/>
     <w:rsid w:val="00B55275"/>
     <w:rsid w:val="00C82BD5"/>
     <w:rsid w:val="00D60774"/>

</xml_diff>